<commit_message>
Improve data accuracy and credibility by integrating verified external data sources
Integrates verified external data (e.g., Census ACS) into the system, enabling a "credibility ladder" for data claims and improving accuracy. Adds a new evidence vault for manual data uploads and ensures consistency across various data outputs. Fixes metric key mismatches to correctly link fetched data to claims.

Replit-Commit-Author: Agent
Replit-Commit-Session-Id: 8105c9d9-29eb-4730-9087-40eedcafe8c8
Replit-Commit-Checkpoint-Type: full_checkpoint
Replit-Commit-Event-Id: a769f506-1aef-449a-a89a-d52cbe26354e
Replit-Commit-Screenshot-Url: https://storage.googleapis.com/screenshot-production-us-central1/55376bb2-2aea-463e-b6a9-2c1d5c123d53/8105c9d9-29eb-4730-9087-40eedcafe8c8/vZpL2e8
Replit-Helium-Checkpoint-Created: true
</commit_message>
<xml_diff>
--- a/attached_assets/decks/Corridor-Intelligence-Brief-v1.docx
+++ b/attached_assets/decks/Corridor-Intelligence-Brief-v1.docx
@@ -35,7 +35,7 @@
         <w:rPr>
           <w:color w:val="777777"/>
         </w:rPr>
-        <w:t xml:space="preserve">Synthesized live from /api/corridor/story · generated 4/17/2026, 6:26:36 PM</w:t>
+        <w:t xml:space="preserve">Synthesized live from /api/corridor/story · generated 4/17/2026, 6:37:48 PM</w:t>
       </w:r>
     </w:p>
     <w:p>
@@ -95,7 +95,7 @@
         <w:spacing w:after="120" w:before="0"/>
       </w:pPr>
       <w:r>
-        <w:t xml:space="preserve">Modeled from the verified Census base: ~4,674 Black children in single-parent households in McLennan and ~12,655 in Travis. Combined Black-male-mentor gap: ~3,812 mentors needed across the corridor.</w:t>
+        <w:t xml:space="preserve">Modeled from the verified Census base: ~5,619 Black children in single-parent households in McLennan and ~12,498 in Travis. Combined Black-male-mentor gap: ~3,986 mentors needed across the corridor.</w:t>
       </w:r>
     </w:p>
     <w:p>
@@ -655,21 +655,21 @@
         <w:tc>
           <w:p>
             <w:r>
-              <w:t xml:space="preserve">40,469</w:t>
-            </w:r>
-          </w:p>
-        </w:tc>
-        <w:tc>
-          <w:p>
-            <w:r>
-              <w:t xml:space="preserve">total_pop × 15.5% Black share (TX Demographic Center est.)</w:t>
-            </w:r>
-          </w:p>
-        </w:tc>
-        <w:tc>
-          <w:p>
-            <w:r>
-              <w:t xml:space="preserve">modeled</w:t>
+              <w:t xml:space="preserve">36,801</w:t>
+            </w:r>
+          </w:p>
+        </w:tc>
+        <w:tc>
+          <w:p>
+            <w:r>
+              <w:t xml:space="preserve">Direct Census API call to ACS 5-year B01001B_001E (Black/African American alone, total).</w:t>
+            </w:r>
+          </w:p>
+        </w:tc>
+        <w:tc>
+          <w:p>
+            <w:r>
+              <w:t xml:space="preserve">verified</w:t>
             </w:r>
           </w:p>
         </w:tc>
@@ -685,21 +685,21 @@
         <w:tc>
           <w:p>
             <w:r>
-              <w:t xml:space="preserve">4,674</w:t>
-            </w:r>
-          </w:p>
-        </w:tc>
-        <w:tc>
-          <w:p>
-            <w:r>
-              <w:t xml:space="preserve">black_pop × 21% (ages 0-17) × 55% (single-parent share among Black families)</w:t>
-            </w:r>
-          </w:p>
-        </w:tc>
-        <w:tc>
-          <w:p>
-            <w:r>
-              <w:t xml:space="preserve">modeled</w:t>
+              <w:t xml:space="preserve">5,619</w:t>
+            </w:r>
+          </w:p>
+        </w:tc>
+        <w:tc>
+          <w:p>
+            <w:r>
+              <w:t xml:space="preserve">verified_black_children_017 (10,217, Census ACS B01001B) × 55% single-parent share</w:t>
+            </w:r>
+          </w:p>
+        </w:tc>
+        <w:tc>
+          <w:p>
+            <w:r>
+              <w:t xml:space="preserve">estimated</w:t>
             </w:r>
           </w:p>
         </w:tc>
@@ -715,21 +715,21 @@
         <w:tc>
           <w:p>
             <w:r>
-              <w:t xml:space="preserve">947</w:t>
-            </w:r>
-          </w:p>
-        </w:tc>
-        <w:tc>
-          <w:p>
-            <w:r>
-              <w:t xml:space="preserve">black_pop × 13% (ages 16-24) × 18% (Black disconnection rate, TX statewide)</w:t>
-            </w:r>
-          </w:p>
-        </w:tc>
-        <w:tc>
-          <w:p>
-            <w:r>
-              <w:t xml:space="preserve">modeled</w:t>
+              <w:t xml:space="preserve">927</w:t>
+            </w:r>
+          </w:p>
+        </w:tc>
+        <w:tc>
+          <w:p>
+            <w:r>
+              <w:t xml:space="preserve">verified_black_youth_18_24 (5,152, Census ACS B01001B) × 18% Black disconnection rate (TX statewide)</w:t>
+            </w:r>
+          </w:p>
+        </w:tc>
+        <w:tc>
+          <w:p>
+            <w:r>
+              <w:t xml:space="preserve">estimated</w:t>
             </w:r>
           </w:p>
         </w:tc>
@@ -745,7 +745,7 @@
         <w:tc>
           <w:p>
             <w:r>
-              <w:t xml:space="preserve">1,028</w:t>
+              <w:t xml:space="preserve">1,236</w:t>
             </w:r>
           </w:p>
         </w:tc>
@@ -759,7 +759,7 @@
         <w:tc>
           <w:p>
             <w:r>
-              <w:t xml:space="preserve">modeled</w:t>
+              <w:t xml:space="preserve">estimated</w:t>
             </w:r>
           </w:p>
         </w:tc>
@@ -831,7 +831,7 @@
         <w:spacing w:after="80"/>
       </w:pPr>
       <w:r>
-        <w:t xml:space="preserve">Modeled fatherhood gap: ~4,674 Black children in single-parent households → ~1,028 Black-male mentors needed → ~947 disconnected Black youth (16–24).</w:t>
+        <w:t xml:space="preserve">Modeled fatherhood gap: ~5,619 Black children in single-parent households → ~1,236 Black-male mentors needed → ~927 disconnected Black youth (16–24).</w:t>
       </w:r>
     </w:p>
     <w:p>
@@ -1413,21 +1413,21 @@
         <w:tc>
           <w:p>
             <w:r>
-              <w:t xml:space="preserve">109,570</w:t>
-            </w:r>
-          </w:p>
-        </w:tc>
-        <w:tc>
-          <w:p>
-            <w:r>
-              <w:t xml:space="preserve">total_pop × 8.5% Black share (TX Demographic Center est.)</w:t>
-            </w:r>
-          </w:p>
-        </w:tc>
-        <w:tc>
-          <w:p>
-            <w:r>
-              <w:t xml:space="preserve">modeled</w:t>
+              <w:t xml:space="preserve">107,055</w:t>
+            </w:r>
+          </w:p>
+        </w:tc>
+        <w:tc>
+          <w:p>
+            <w:r>
+              <w:t xml:space="preserve">Direct Census API call to ACS 5-year B01001B_001E (Black/African American alone, total).</w:t>
+            </w:r>
+          </w:p>
+        </w:tc>
+        <w:tc>
+          <w:p>
+            <w:r>
+              <w:t xml:space="preserve">verified</w:t>
             </w:r>
           </w:p>
         </w:tc>
@@ -1443,21 +1443,21 @@
         <w:tc>
           <w:p>
             <w:r>
-              <w:t xml:space="preserve">12,655</w:t>
-            </w:r>
-          </w:p>
-        </w:tc>
-        <w:tc>
-          <w:p>
-            <w:r>
-              <w:t xml:space="preserve">black_pop × 21% (ages 0-17) × 55% (single-parent share among Black families)</w:t>
-            </w:r>
-          </w:p>
-        </w:tc>
-        <w:tc>
-          <w:p>
-            <w:r>
-              <w:t xml:space="preserve">modeled</w:t>
+              <w:t xml:space="preserve">12,498</w:t>
+            </w:r>
+          </w:p>
+        </w:tc>
+        <w:tc>
+          <w:p>
+            <w:r>
+              <w:t xml:space="preserve">verified_black_children_017 (22,723, Census ACS B01001B) × 55% single-parent share</w:t>
+            </w:r>
+          </w:p>
+        </w:tc>
+        <w:tc>
+          <w:p>
+            <w:r>
+              <w:t xml:space="preserve">estimated</w:t>
             </w:r>
           </w:p>
         </w:tc>
@@ -1473,21 +1473,21 @@
         <w:tc>
           <w:p>
             <w:r>
-              <w:t xml:space="preserve">2,564</w:t>
-            </w:r>
-          </w:p>
-        </w:tc>
-        <w:tc>
-          <w:p>
-            <w:r>
-              <w:t xml:space="preserve">black_pop × 13% (ages 16-24) × 18% (Black disconnection rate, TX statewide)</w:t>
-            </w:r>
-          </w:p>
-        </w:tc>
-        <w:tc>
-          <w:p>
-            <w:r>
-              <w:t xml:space="preserve">modeled</w:t>
+              <w:t xml:space="preserve">2,039</w:t>
+            </w:r>
+          </w:p>
+        </w:tc>
+        <w:tc>
+          <w:p>
+            <w:r>
+              <w:t xml:space="preserve">verified_black_youth_18_24 (11,326, Census ACS B01001B) × 18% Black disconnection rate (TX statewide)</w:t>
+            </w:r>
+          </w:p>
+        </w:tc>
+        <w:tc>
+          <w:p>
+            <w:r>
+              <w:t xml:space="preserve">estimated</w:t>
             </w:r>
           </w:p>
         </w:tc>
@@ -1503,7 +1503,7 @@
         <w:tc>
           <w:p>
             <w:r>
-              <w:t xml:space="preserve">2,784</w:t>
+              <w:t xml:space="preserve">2,750</w:t>
             </w:r>
           </w:p>
         </w:tc>
@@ -1517,7 +1517,7 @@
         <w:tc>
           <w:p>
             <w:r>
-              <w:t xml:space="preserve">modeled</w:t>
+              <w:t xml:space="preserve">estimated</w:t>
             </w:r>
           </w:p>
         </w:tc>
@@ -1589,7 +1589,7 @@
         <w:spacing w:after="80"/>
       </w:pPr>
       <w:r>
-        <w:t xml:space="preserve">Modeled fatherhood gap: ~12,655 Black children in single-parent households → ~2,784 Black-male mentors needed → ~2,564 disconnected Black youth (16–24).</w:t>
+        <w:t xml:space="preserve">Modeled fatherhood gap: ~12,498 Black children in single-parent households → ~2,750 Black-male mentors needed → ~2,039 disconnected Black youth (16–24).</w:t>
       </w:r>
     </w:p>
     <w:p>

</xml_diff>

<commit_message>
Add live data view and deck regeneration for corridor documents
Adds a new client-side page for viewing live corridor data, a button to regenerate PPTX/DOCX decks on the corridor docs page, and updates the build scripts to handle object-based crime profile data.

Replit-Commit-Author: Agent
Replit-Commit-Session-Id: 8105c9d9-29eb-4730-9087-40eedcafe8c8
Replit-Commit-Checkpoint-Type: full_checkpoint
Replit-Commit-Event-Id: b03db97f-c290-4a53-b2c6-2fb6d8002b3e
Replit-Commit-Screenshot-Url: https://storage.googleapis.com/screenshot-production-us-central1/55376bb2-2aea-463e-b6a9-2c1d5c123d53/8105c9d9-29eb-4730-9087-40eedcafe8c8/Q9iZh33
Replit-Helium-Checkpoint-Created: true
</commit_message>
<xml_diff>
--- a/attached_assets/decks/Corridor-Intelligence-Brief-v1.docx
+++ b/attached_assets/decks/Corridor-Intelligence-Brief-v1.docx
@@ -35,7 +35,7 @@
         <w:rPr>
           <w:color w:val="777777"/>
         </w:rPr>
-        <w:t xml:space="preserve">Synthesized live from /api/corridor/story · generated 4/17/2026, 6:37:48 PM</w:t>
+        <w:t xml:space="preserve">Synthesized live from /api/corridor/story · generated 4/17/2026, 7:21:46 PM</w:t>
       </w:r>
     </w:p>
     <w:p>
@@ -662,7 +662,7 @@
         <w:tc>
           <w:p>
             <w:r>
-              <w:t xml:space="preserve">Direct Census API call to ACS 5-year B01001B_001E (Black/African American alone, total).</w:t>
+              <w:t xml:space="preserve">CHAIN STEP 2 · Cites step 1 (total_population). Direct Census API call for Black alone total (14.1% of verified total 261,090).</w:t>
             </w:r>
           </w:p>
         </w:tc>
@@ -1420,7 +1420,7 @@
         <w:tc>
           <w:p>
             <w:r>
-              <w:t xml:space="preserve">Direct Census API call to ACS 5-year B01001B_001E (Black/African American alone, total).</w:t>
+              <w:t xml:space="preserve">CHAIN STEP 2 · Cites step 1 (total_population). Direct Census API call for Black alone total (8.3% of verified total 1,289,054).</w:t>
             </w:r>
           </w:p>
         </w:tc>

</xml_diff>